<commit_message>
Revised professor's title to Dr.
</commit_message>
<xml_diff>
--- a/progress report/final_report/Final_Technical_Report_Revised_2.docx
+++ b/progress report/final_report/Final_Technical_Report_Revised_2.docx
@@ -51,7 +51,13 @@
         <w:t>Supervisor:</w:t>
       </w:r>
       <w:r>
-        <w:t xml:space="preserve"> Professor Sukhwant Kaur Sagar</w:t>
+        <w:t xml:space="preserve"> </w:t>
+      </w:r>
+      <w:r>
+        <w:t>Dr.</w:t>
+      </w:r>
+      <w:r>
+        <w:t xml:space="preserve"> Sukhwant Kaur Sagar</w:t>
       </w:r>
       <w:r>
         <w:br/>
@@ -3961,8 +3967,8 @@
           <w:u w:val="single"/>
         </w:rPr>
       </w:pPr>
-      <w:bookmarkStart w:id="3" w:name="introduction-background"/>
-      <w:bookmarkStart w:id="4" w:name="_Toc237672657"/>
+      <w:bookmarkStart w:id="3" w:name="_Toc237672657"/>
+      <w:bookmarkStart w:id="4" w:name="introduction-background"/>
       <w:bookmarkEnd w:id="1"/>
       <w:r>
         <w:rPr>
@@ -3973,7 +3979,7 @@
         </w:rPr>
         <w:t>1. Introduction &amp; Background</w:t>
       </w:r>
-      <w:bookmarkEnd w:id="4"/>
+      <w:bookmarkEnd w:id="3"/>
     </w:p>
     <w:p>
       <w:pPr>
@@ -3984,8 +3990,8 @@
           <w:color w:val="E97132" w:themeColor="accent2"/>
         </w:rPr>
       </w:pPr>
-      <w:bookmarkStart w:id="5" w:name="llm-integrated-applications"/>
-      <w:bookmarkStart w:id="6" w:name="_Toc237672658"/>
+      <w:bookmarkStart w:id="5" w:name="_Toc237672658"/>
+      <w:bookmarkStart w:id="6" w:name="llm-integrated-applications"/>
       <w:r>
         <w:rPr>
           <w:i/>
@@ -3994,7 +4000,7 @@
         </w:rPr>
         <w:t>1.1 LLM-Integrated Applications</w:t>
       </w:r>
-      <w:bookmarkEnd w:id="6"/>
+      <w:bookmarkEnd w:id="5"/>
     </w:p>
     <w:p>
       <w:pPr>
@@ -4021,9 +4027,9 @@
           <w:color w:val="E97132" w:themeColor="accent2"/>
         </w:rPr>
       </w:pPr>
-      <w:bookmarkStart w:id="7" w:name="prompt-injection-threat-model"/>
-      <w:bookmarkStart w:id="8" w:name="_Toc237672659"/>
-      <w:bookmarkEnd w:id="5"/>
+      <w:bookmarkStart w:id="7" w:name="_Toc237672659"/>
+      <w:bookmarkStart w:id="8" w:name="prompt-injection-threat-model"/>
+      <w:bookmarkEnd w:id="6"/>
       <w:r>
         <w:rPr>
           <w:i/>
@@ -4032,7 +4038,7 @@
         </w:rPr>
         <w:t>1.2 Prompt Injection Threat Model</w:t>
       </w:r>
-      <w:bookmarkEnd w:id="8"/>
+      <w:bookmarkEnd w:id="7"/>
     </w:p>
     <w:p>
       <w:pPr>
@@ -4448,9 +4454,9 @@
           <w:color w:val="E97132" w:themeColor="accent2"/>
         </w:rPr>
       </w:pPr>
-      <w:bookmarkStart w:id="9" w:name="why-distilbert"/>
-      <w:bookmarkStart w:id="10" w:name="_Toc237672660"/>
-      <w:bookmarkEnd w:id="7"/>
+      <w:bookmarkStart w:id="9" w:name="_Toc237672660"/>
+      <w:bookmarkStart w:id="10" w:name="why-distilbert"/>
+      <w:bookmarkEnd w:id="8"/>
       <w:r>
         <w:rPr>
           <w:i/>
@@ -4459,7 +4465,7 @@
         </w:rPr>
         <w:t>1.3 Why DistilBERT</w:t>
       </w:r>
-      <w:bookmarkEnd w:id="10"/>
+      <w:bookmarkEnd w:id="9"/>
     </w:p>
     <w:p>
       <w:pPr>
@@ -4779,9 +4785,9 @@
           <w:color w:val="E97132" w:themeColor="accent2"/>
         </w:rPr>
       </w:pPr>
-      <w:bookmarkStart w:id="11" w:name="evaluation-criteria"/>
-      <w:bookmarkStart w:id="12" w:name="_Toc237672661"/>
-      <w:bookmarkEnd w:id="9"/>
+      <w:bookmarkStart w:id="11" w:name="_Toc237672661"/>
+      <w:bookmarkStart w:id="12" w:name="evaluation-criteria"/>
+      <w:bookmarkEnd w:id="10"/>
       <w:r>
         <w:rPr>
           <w:i/>
@@ -4790,7 +4796,7 @@
         </w:rPr>
         <w:t>1.4 Evaluation Criteria</w:t>
       </w:r>
-      <w:bookmarkEnd w:id="12"/>
+      <w:bookmarkEnd w:id="11"/>
     </w:p>
     <w:tbl>
       <w:tblPr>
@@ -5101,10 +5107,10 @@
           <w:u w:val="single"/>
         </w:rPr>
       </w:pPr>
-      <w:bookmarkStart w:id="13" w:name="X29bc0a12b16f290bdace4a1398f537b49c0ab26"/>
-      <w:bookmarkStart w:id="14" w:name="_Toc237672662"/>
-      <w:bookmarkEnd w:id="3"/>
-      <w:bookmarkEnd w:id="11"/>
+      <w:bookmarkStart w:id="13" w:name="_Toc237672662"/>
+      <w:bookmarkStart w:id="14" w:name="X29bc0a12b16f290bdace4a1398f537b49c0ab26"/>
+      <w:bookmarkEnd w:id="4"/>
+      <w:bookmarkEnd w:id="12"/>
       <w:r>
         <w:rPr>
           <w:b/>
@@ -5114,7 +5120,7 @@
         </w:rPr>
         <w:t>2. How a Transformer Encoder Produces a Classification Probability</w:t>
       </w:r>
-      <w:bookmarkEnd w:id="14"/>
+      <w:bookmarkEnd w:id="13"/>
     </w:p>
     <w:p>
       <w:pPr>
@@ -5168,8 +5174,8 @@
           <w:color w:val="E97132" w:themeColor="accent2"/>
         </w:rPr>
       </w:pPr>
-      <w:bookmarkStart w:id="15" w:name="tokenization-string-integer-ids"/>
-      <w:bookmarkStart w:id="16" w:name="_Toc237672663"/>
+      <w:bookmarkStart w:id="15" w:name="_Toc237672663"/>
+      <w:bookmarkStart w:id="16" w:name="tokenization-string-integer-ids"/>
       <w:r>
         <w:rPr>
           <w:i/>
@@ -5178,7 +5184,7 @@
         </w:rPr>
         <w:t>2.1 Tokenization (string → integer IDs)</w:t>
       </w:r>
-      <w:bookmarkEnd w:id="16"/>
+      <w:bookmarkEnd w:id="15"/>
     </w:p>
     <w:p>
       <w:pPr>
@@ -5454,9 +5460,9 @@
           <w:color w:val="E97132" w:themeColor="accent2"/>
         </w:rPr>
       </w:pPr>
-      <w:bookmarkStart w:id="17" w:name="from-ids-to-a-prompt-summary-cls"/>
-      <w:bookmarkStart w:id="18" w:name="_Toc237672664"/>
-      <w:bookmarkEnd w:id="15"/>
+      <w:bookmarkStart w:id="17" w:name="_Toc237672664"/>
+      <w:bookmarkStart w:id="18" w:name="from-ids-to-a-prompt-summary-cls"/>
+      <w:bookmarkEnd w:id="16"/>
       <w:r>
         <w:rPr>
           <w:i/>
@@ -5482,7 +5488,7 @@
         </w:rPr>
         <w:t>)</w:t>
       </w:r>
-      <w:bookmarkEnd w:id="18"/>
+      <w:bookmarkEnd w:id="17"/>
     </w:p>
     <w:p>
       <w:pPr>
@@ -5705,9 +5711,9 @@
           <w:color w:val="E97132" w:themeColor="accent2"/>
         </w:rPr>
       </w:pPr>
-      <w:bookmarkStart w:id="19" w:name="classification-head-softmax-label"/>
-      <w:bookmarkStart w:id="20" w:name="_Toc237672665"/>
-      <w:bookmarkEnd w:id="17"/>
+      <w:bookmarkStart w:id="19" w:name="_Toc237672665"/>
+      <w:bookmarkStart w:id="20" w:name="classification-head-softmax-label"/>
+      <w:bookmarkEnd w:id="18"/>
       <w:r>
         <w:rPr>
           <w:i/>
@@ -5734,7 +5740,7 @@
         </w:rPr>
         <w:t xml:space="preserve"> → label</w:t>
       </w:r>
-      <w:bookmarkEnd w:id="20"/>
+      <w:bookmarkEnd w:id="19"/>
     </w:p>
     <w:p>
       <w:pPr>
@@ -6519,9 +6525,9 @@
           <w:color w:val="E97132" w:themeColor="accent2"/>
         </w:rPr>
       </w:pPr>
-      <w:bookmarkStart w:id="21" w:name="end-to-end-summary"/>
-      <w:bookmarkStart w:id="22" w:name="_Toc237672666"/>
-      <w:bookmarkEnd w:id="19"/>
+      <w:bookmarkStart w:id="21" w:name="_Toc237672666"/>
+      <w:bookmarkStart w:id="22" w:name="end-to-end-summary"/>
+      <w:bookmarkEnd w:id="20"/>
       <w:r>
         <w:rPr>
           <w:i/>
@@ -6530,7 +6536,7 @@
         </w:rPr>
         <w:t>2.4 End-to-end summary</w:t>
       </w:r>
-      <w:bookmarkEnd w:id="22"/>
+      <w:bookmarkEnd w:id="21"/>
     </w:p>
     <w:p>
       <w:pPr>
@@ -6774,10 +6780,10 @@
           <w:u w:val="single"/>
         </w:rPr>
       </w:pPr>
-      <w:bookmarkStart w:id="23" w:name="system-design"/>
-      <w:bookmarkStart w:id="24" w:name="_Toc237672667"/>
-      <w:bookmarkEnd w:id="13"/>
-      <w:bookmarkEnd w:id="21"/>
+      <w:bookmarkStart w:id="23" w:name="_Toc237672667"/>
+      <w:bookmarkStart w:id="24" w:name="system-design"/>
+      <w:bookmarkEnd w:id="14"/>
+      <w:bookmarkEnd w:id="22"/>
       <w:r>
         <w:rPr>
           <w:b/>
@@ -6787,7 +6793,7 @@
         </w:rPr>
         <w:t>3. System Design</w:t>
       </w:r>
-      <w:bookmarkEnd w:id="24"/>
+      <w:bookmarkEnd w:id="23"/>
     </w:p>
     <w:p>
       <w:pPr>
@@ -6798,8 +6804,8 @@
           <w:color w:val="E97132" w:themeColor="accent2"/>
         </w:rPr>
       </w:pPr>
-      <w:bookmarkStart w:id="25" w:name="high-level-architecture"/>
-      <w:bookmarkStart w:id="26" w:name="_Toc237672668"/>
+      <w:bookmarkStart w:id="25" w:name="_Toc237672668"/>
+      <w:bookmarkStart w:id="26" w:name="high-level-architecture"/>
       <w:r>
         <w:rPr>
           <w:i/>
@@ -6808,7 +6814,7 @@
         </w:rPr>
         <w:t>3.1 High-Level Architecture</w:t>
       </w:r>
-      <w:bookmarkEnd w:id="26"/>
+      <w:bookmarkEnd w:id="25"/>
     </w:p>
     <w:p>
       <w:pPr>
@@ -7078,9 +7084,9 @@
           <w:color w:val="E97132" w:themeColor="accent2"/>
         </w:rPr>
       </w:pPr>
-      <w:bookmarkStart w:id="27" w:name="X059c3330632bb5d6027621361e78d414e54acf0"/>
-      <w:bookmarkStart w:id="28" w:name="_Toc237672669"/>
-      <w:bookmarkEnd w:id="25"/>
+      <w:bookmarkStart w:id="27" w:name="_Toc237672669"/>
+      <w:bookmarkStart w:id="28" w:name="X059c3330632bb5d6027621361e78d414e54acf0"/>
+      <w:bookmarkEnd w:id="26"/>
       <w:r>
         <w:rPr>
           <w:i/>
@@ -7090,7 +7096,7 @@
         <w:lastRenderedPageBreak/>
         <w:t>3.2 Dataset Construction &amp; Data Lock (Milestone 2a)</w:t>
       </w:r>
-      <w:bookmarkEnd w:id="28"/>
+      <w:bookmarkEnd w:id="27"/>
     </w:p>
     <w:p>
       <w:pPr>
@@ -7649,9 +7655,9 @@
           <w:color w:val="E97132" w:themeColor="accent2"/>
         </w:rPr>
       </w:pPr>
-      <w:bookmarkStart w:id="29" w:name="Xc0b4e94375eb0e1507142fbc15dd1b0afd91027"/>
-      <w:bookmarkStart w:id="30" w:name="_Toc237672670"/>
-      <w:bookmarkEnd w:id="27"/>
+      <w:bookmarkStart w:id="29" w:name="_Toc237672670"/>
+      <w:bookmarkStart w:id="30" w:name="Xc0b4e94375eb0e1507142fbc15dd1b0afd91027"/>
+      <w:bookmarkEnd w:id="28"/>
       <w:r>
         <w:rPr>
           <w:i/>
@@ -7660,7 +7666,7 @@
         </w:rPr>
         <w:t>3.3 Champion Model: Custom DistilBERT (Milestone 3)</w:t>
       </w:r>
-      <w:bookmarkEnd w:id="30"/>
+      <w:bookmarkEnd w:id="29"/>
     </w:p>
     <w:p>
       <w:pPr>
@@ -7677,15 +7683,15 @@
           <w:color w:val="auto"/>
         </w:rPr>
       </w:pPr>
-      <w:bookmarkStart w:id="31" w:name="X7db04a39c96fb658b45d35c20d9b3320c139af9"/>
-      <w:bookmarkStart w:id="32" w:name="_Toc237672671"/>
+      <w:bookmarkStart w:id="31" w:name="_Toc237672671"/>
+      <w:bookmarkStart w:id="32" w:name="X7db04a39c96fb658b45d35c20d9b3320c139af9"/>
       <w:r>
         <w:rPr>
           <w:color w:val="auto"/>
         </w:rPr>
         <w:t>Strategy 1 — Left-side tokenizer engineering (recall)</w:t>
       </w:r>
-      <w:bookmarkEnd w:id="32"/>
+      <w:bookmarkEnd w:id="31"/>
     </w:p>
     <w:p>
       <w:pPr>
@@ -7721,16 +7727,16 @@
           <w:color w:val="auto"/>
         </w:rPr>
       </w:pPr>
-      <w:bookmarkStart w:id="33" w:name="strategy-2-asymmetric-class-weights-fpr"/>
-      <w:bookmarkStart w:id="34" w:name="_Toc237672672"/>
-      <w:bookmarkEnd w:id="31"/>
+      <w:bookmarkStart w:id="33" w:name="_Toc237672672"/>
+      <w:bookmarkStart w:id="34" w:name="strategy-2-asymmetric-class-weights-fpr"/>
+      <w:bookmarkEnd w:id="32"/>
       <w:r>
         <w:rPr>
           <w:color w:val="auto"/>
         </w:rPr>
         <w:t>Strategy 2 — Asymmetric class weights (FPR)</w:t>
       </w:r>
-      <w:bookmarkEnd w:id="34"/>
+      <w:bookmarkEnd w:id="33"/>
     </w:p>
     <w:p>
       <w:pPr>
@@ -8788,16 +8794,16 @@
           <w:color w:val="auto"/>
         </w:rPr>
       </w:pPr>
-      <w:bookmarkStart w:id="35" w:name="Xeb6555d2e52300704da06fe6e885a8f40ba7750"/>
-      <w:bookmarkStart w:id="36" w:name="_Toc237672673"/>
-      <w:bookmarkEnd w:id="33"/>
+      <w:bookmarkStart w:id="35" w:name="_Toc237672673"/>
+      <w:bookmarkStart w:id="36" w:name="Xeb6555d2e52300704da06fe6e885a8f40ba7750"/>
+      <w:bookmarkEnd w:id="34"/>
       <w:r>
         <w:rPr>
           <w:color w:val="auto"/>
         </w:rPr>
         <w:t>Strategy 3 — Validation-driven epoch selection (overfitting control)</w:t>
       </w:r>
-      <w:bookmarkEnd w:id="36"/>
+      <w:bookmarkEnd w:id="35"/>
     </w:p>
     <w:p>
       <w:pPr>
@@ -9292,10 +9298,10 @@
           <w:color w:val="E97132" w:themeColor="accent2"/>
         </w:rPr>
       </w:pPr>
-      <w:bookmarkStart w:id="37" w:name="X848705decac8aefb0c8e4c665cef0b0255fadac"/>
-      <w:bookmarkStart w:id="38" w:name="_Toc237672674"/>
-      <w:bookmarkEnd w:id="29"/>
-      <w:bookmarkEnd w:id="35"/>
+      <w:bookmarkStart w:id="37" w:name="_Toc237672674"/>
+      <w:bookmarkStart w:id="38" w:name="X848705decac8aefb0c8e4c665cef0b0255fadac"/>
+      <w:bookmarkEnd w:id="30"/>
+      <w:bookmarkEnd w:id="36"/>
       <w:r>
         <w:rPr>
           <w:i/>
@@ -9304,7 +9310,7 @@
         </w:rPr>
         <w:t>3.4 Learning Rate, Weight Decay, and the Motivation for a 2D Grid Search</w:t>
       </w:r>
-      <w:bookmarkEnd w:id="38"/>
+      <w:bookmarkEnd w:id="37"/>
     </w:p>
     <w:p>
       <w:pPr>
@@ -9445,15 +9451,15 @@
           <w:color w:val="E97132" w:themeColor="accent2"/>
         </w:rPr>
       </w:pPr>
-      <w:bookmarkStart w:id="39" w:name="X61fc48c9df8b2ce9f5493685f2a64f02fe4ee98"/>
-      <w:bookmarkStart w:id="40" w:name="_Toc237672675"/>
+      <w:bookmarkStart w:id="39" w:name="_Toc237672675"/>
+      <w:bookmarkStart w:id="40" w:name="X61fc48c9df8b2ce9f5493685f2a64f02fe4ee98"/>
       <w:r>
         <w:rPr>
           <w:color w:val="E97132" w:themeColor="accent2"/>
         </w:rPr>
         <w:t>3.4.0 What is a “loss landscape”? (beginner explanation)</w:t>
       </w:r>
-      <w:bookmarkEnd w:id="40"/>
+      <w:bookmarkEnd w:id="39"/>
     </w:p>
     <w:p>
       <w:pPr>
@@ -9920,16 +9926,16 @@
           <w:color w:val="E97132" w:themeColor="accent2"/>
         </w:rPr>
       </w:pPr>
-      <w:bookmarkStart w:id="41" w:name="X167bb22f74dc23ea630948812a52a30b8a52610"/>
-      <w:bookmarkStart w:id="42" w:name="_Toc237672676"/>
-      <w:bookmarkEnd w:id="39"/>
+      <w:bookmarkStart w:id="41" w:name="_Toc237672676"/>
+      <w:bookmarkStart w:id="42" w:name="X167bb22f74dc23ea630948812a52a30b8a52610"/>
+      <w:bookmarkEnd w:id="40"/>
       <w:r>
         <w:rPr>
           <w:color w:val="E97132" w:themeColor="accent2"/>
         </w:rPr>
         <w:t>3.4.1 Learning rate — how big each hiking step is</w:t>
       </w:r>
-      <w:bookmarkEnd w:id="42"/>
+      <w:bookmarkEnd w:id="41"/>
     </w:p>
     <w:p>
       <w:pPr>
@@ -10664,16 +10670,16 @@
           <w:color w:val="E97132" w:themeColor="accent2"/>
         </w:rPr>
       </w:pPr>
-      <w:bookmarkStart w:id="43" w:name="Xb93f6ddd8c2ae6a622ee14e5abe1ec143808962"/>
-      <w:bookmarkStart w:id="44" w:name="_Toc237672677"/>
-      <w:bookmarkEnd w:id="41"/>
+      <w:bookmarkStart w:id="43" w:name="_Toc237672677"/>
+      <w:bookmarkStart w:id="44" w:name="Xb93f6ddd8c2ae6a622ee14e5abe1ec143808962"/>
+      <w:bookmarkEnd w:id="42"/>
       <w:r>
         <w:rPr>
           <w:color w:val="E97132" w:themeColor="accent2"/>
         </w:rPr>
         <w:t>3.4.2 Weight decay — a “don’t memorize with huge weights” penalty</w:t>
       </w:r>
-      <w:bookmarkEnd w:id="44"/>
+      <w:bookmarkEnd w:id="43"/>
     </w:p>
     <w:p>
       <w:pPr>
@@ -11278,16 +11284,16 @@
           <w:color w:val="E97132" w:themeColor="accent2"/>
         </w:rPr>
       </w:pPr>
-      <w:bookmarkStart w:id="45" w:name="why-we-need-a-2d-grid-lr-and-wd-interact"/>
-      <w:bookmarkStart w:id="46" w:name="_Toc237672678"/>
-      <w:bookmarkEnd w:id="43"/>
+      <w:bookmarkStart w:id="45" w:name="_Toc237672678"/>
+      <w:bookmarkStart w:id="46" w:name="why-we-need-a-2d-grid-lr-and-wd-interact"/>
+      <w:bookmarkEnd w:id="44"/>
       <w:r>
         <w:rPr>
           <w:color w:val="E97132" w:themeColor="accent2"/>
         </w:rPr>
         <w:t>3.4.3 Why we need a 2D grid (LR and WD interact)</w:t>
       </w:r>
-      <w:bookmarkEnd w:id="46"/>
+      <w:bookmarkEnd w:id="45"/>
     </w:p>
     <w:p>
       <w:pPr>
@@ -11907,10 +11913,10 @@
           <w:color w:val="E97132" w:themeColor="accent2"/>
         </w:rPr>
       </w:pPr>
-      <w:bookmarkStart w:id="47" w:name="alternative-paradigms-milestone-4"/>
-      <w:bookmarkStart w:id="48" w:name="_Toc237672679"/>
-      <w:bookmarkEnd w:id="37"/>
-      <w:bookmarkEnd w:id="45"/>
+      <w:bookmarkStart w:id="47" w:name="_Toc237672679"/>
+      <w:bookmarkStart w:id="48" w:name="alternative-paradigms-milestone-4"/>
+      <w:bookmarkEnd w:id="38"/>
+      <w:bookmarkEnd w:id="46"/>
       <w:r>
         <w:rPr>
           <w:i/>
@@ -11919,7 +11925,7 @@
         </w:rPr>
         <w:t>3.5 Alternative Paradigms (Milestone 4)</w:t>
       </w:r>
-      <w:bookmarkEnd w:id="48"/>
+      <w:bookmarkEnd w:id="47"/>
     </w:p>
     <w:p>
       <w:pPr>
@@ -11928,15 +11934,15 @@
           <w:color w:val="auto"/>
         </w:rPr>
       </w:pPr>
-      <w:bookmarkStart w:id="49" w:name="paradigm-a-embedding-vector-database"/>
-      <w:bookmarkStart w:id="50" w:name="_Toc237672680"/>
+      <w:bookmarkStart w:id="49" w:name="_Toc237672680"/>
+      <w:bookmarkStart w:id="50" w:name="paradigm-a-embedding-vector-database"/>
       <w:r>
         <w:rPr>
           <w:color w:val="auto"/>
         </w:rPr>
         <w:t>Paradigm A — Embedding Vector Database</w:t>
       </w:r>
-      <w:bookmarkEnd w:id="50"/>
+      <w:bookmarkEnd w:id="49"/>
     </w:p>
     <w:p>
       <w:pPr>
@@ -12118,16 +12124,16 @@
           <w:color w:val="auto"/>
         </w:rPr>
       </w:pPr>
-      <w:bookmarkStart w:id="51" w:name="paradigm-b-local-llm-as-a-judge"/>
-      <w:bookmarkStart w:id="52" w:name="_Toc237672681"/>
-      <w:bookmarkEnd w:id="49"/>
+      <w:bookmarkStart w:id="51" w:name="_Toc237672681"/>
+      <w:bookmarkStart w:id="52" w:name="paradigm-b-local-llm-as-a-judge"/>
+      <w:bookmarkEnd w:id="50"/>
       <w:r>
         <w:rPr>
           <w:color w:val="auto"/>
         </w:rPr>
         <w:t>Paradigm B — Local LLM-as-a-Judge</w:t>
       </w:r>
-      <w:bookmarkEnd w:id="52"/>
+      <w:bookmarkEnd w:id="51"/>
     </w:p>
     <w:p>
       <w:pPr>
@@ -12219,9 +12225,9 @@
           <w:color w:val="auto"/>
         </w:rPr>
       </w:pPr>
-      <w:bookmarkStart w:id="53" w:name="automated-benchmarking"/>
-      <w:bookmarkStart w:id="54" w:name="_Toc237672682"/>
-      <w:bookmarkEnd w:id="51"/>
+      <w:bookmarkStart w:id="53" w:name="_Toc237672682"/>
+      <w:bookmarkStart w:id="54" w:name="automated-benchmarking"/>
+      <w:bookmarkEnd w:id="52"/>
       <w:r>
         <w:rPr>
           <w:color w:val="auto"/>
@@ -12229,7 +12235,7 @@
         <w:lastRenderedPageBreak/>
         <w:t>Automated benchmarking</w:t>
       </w:r>
-      <w:bookmarkEnd w:id="54"/>
+      <w:bookmarkEnd w:id="53"/>
     </w:p>
     <w:p>
       <w:pPr>
@@ -12271,10 +12277,10 @@
           <w:color w:val="E97132" w:themeColor="accent2"/>
         </w:rPr>
       </w:pPr>
-      <w:bookmarkStart w:id="55" w:name="X7f7406bd9e7c1151470b9b8de548157116e5c48"/>
-      <w:bookmarkStart w:id="56" w:name="_Toc237672683"/>
-      <w:bookmarkEnd w:id="47"/>
-      <w:bookmarkEnd w:id="53"/>
+      <w:bookmarkStart w:id="55" w:name="_Toc237672683"/>
+      <w:bookmarkStart w:id="56" w:name="X7f7406bd9e7c1151470b9b8de548157116e5c48"/>
+      <w:bookmarkEnd w:id="48"/>
+      <w:bookmarkEnd w:id="54"/>
       <w:r>
         <w:rPr>
           <w:i/>
@@ -12283,7 +12289,7 @@
         </w:rPr>
         <w:t>3.6 Hyperparameter Optimization Summary (Milestone 5A)</w:t>
       </w:r>
-      <w:bookmarkEnd w:id="56"/>
+      <w:bookmarkEnd w:id="55"/>
     </w:p>
     <w:p>
       <w:pPr>
@@ -12539,9 +12545,9 @@
           <w:color w:val="E97132" w:themeColor="accent2"/>
         </w:rPr>
       </w:pPr>
-      <w:bookmarkStart w:id="57" w:name="ood-protocol-bipia-milestone-5b"/>
-      <w:bookmarkStart w:id="58" w:name="_Toc237672684"/>
-      <w:bookmarkEnd w:id="55"/>
+      <w:bookmarkStart w:id="57" w:name="_Toc237672684"/>
+      <w:bookmarkStart w:id="58" w:name="ood-protocol-bipia-milestone-5b"/>
+      <w:bookmarkEnd w:id="56"/>
       <w:r>
         <w:rPr>
           <w:i/>
@@ -12550,7 +12556,7 @@
         </w:rPr>
         <w:t>3.7 OOD Protocol — BIPIA (Milestone 5B)</w:t>
       </w:r>
-      <w:bookmarkEnd w:id="58"/>
+      <w:bookmarkEnd w:id="57"/>
     </w:p>
     <w:p>
       <w:pPr>
@@ -12697,10 +12703,10 @@
           <w:u w:val="single"/>
         </w:rPr>
       </w:pPr>
-      <w:bookmarkStart w:id="59" w:name="benchmarking-data"/>
-      <w:bookmarkStart w:id="60" w:name="_Toc237672685"/>
-      <w:bookmarkEnd w:id="23"/>
-      <w:bookmarkEnd w:id="57"/>
+      <w:bookmarkStart w:id="59" w:name="_Toc237672685"/>
+      <w:bookmarkStart w:id="60" w:name="benchmarking-data"/>
+      <w:bookmarkEnd w:id="24"/>
+      <w:bookmarkEnd w:id="58"/>
       <w:r>
         <w:rPr>
           <w:b/>
@@ -12710,7 +12716,7 @@
         </w:rPr>
         <w:t>4. Benchmarking Data</w:t>
       </w:r>
-      <w:bookmarkEnd w:id="60"/>
+      <w:bookmarkEnd w:id="59"/>
     </w:p>
     <w:p>
       <w:pPr>
@@ -12721,8 +12727,8 @@
           <w:color w:val="E97132" w:themeColor="accent2"/>
         </w:rPr>
       </w:pPr>
-      <w:bookmarkStart w:id="61" w:name="protectai-baseline-frozen-test-set"/>
-      <w:bookmarkStart w:id="62" w:name="_Toc237672686"/>
+      <w:bookmarkStart w:id="61" w:name="_Toc237672686"/>
+      <w:bookmarkStart w:id="62" w:name="protectai-baseline-frozen-test-set"/>
       <w:r>
         <w:rPr>
           <w:i/>
@@ -12731,7 +12737,7 @@
         </w:rPr>
         <w:t>4.1 ProtectAI Baseline (Frozen Test Set)</w:t>
       </w:r>
-      <w:bookmarkEnd w:id="62"/>
+      <w:bookmarkEnd w:id="61"/>
     </w:p>
     <w:tbl>
       <w:tblPr>
@@ -13036,9 +13042,9 @@
           <w:color w:val="E97132" w:themeColor="accent2"/>
         </w:rPr>
       </w:pPr>
-      <w:bookmarkStart w:id="63" w:name="custom-distilbert-validation-epoch-trace"/>
-      <w:bookmarkStart w:id="64" w:name="_Toc237672687"/>
-      <w:bookmarkEnd w:id="61"/>
+      <w:bookmarkStart w:id="63" w:name="_Toc237672687"/>
+      <w:bookmarkStart w:id="64" w:name="custom-distilbert-validation-epoch-trace"/>
+      <w:bookmarkEnd w:id="62"/>
       <w:r>
         <w:rPr>
           <w:i/>
@@ -13047,7 +13053,7 @@
         </w:rPr>
         <w:t>4.2 Custom DistilBERT — Validation Epoch Trace</w:t>
       </w:r>
-      <w:bookmarkEnd w:id="64"/>
+      <w:bookmarkEnd w:id="63"/>
     </w:p>
     <w:tbl>
       <w:tblPr>
@@ -13306,9 +13312,9 @@
           <w:color w:val="E97132" w:themeColor="accent2"/>
         </w:rPr>
       </w:pPr>
-      <w:bookmarkStart w:id="65" w:name="X6b0db75a0c9aefbb22f7d7441d9a5587ec27c27"/>
-      <w:bookmarkStart w:id="66" w:name="_Toc237672688"/>
-      <w:bookmarkEnd w:id="63"/>
+      <w:bookmarkStart w:id="65" w:name="_Toc237672688"/>
+      <w:bookmarkStart w:id="66" w:name="X6b0db75a0c9aefbb22f7d7441d9a5587ec27c27"/>
+      <w:bookmarkEnd w:id="64"/>
       <w:r>
         <w:rPr>
           <w:i/>
@@ -13317,7 +13323,7 @@
         </w:rPr>
         <w:t>4.3 Custom DistilBERT — Blind Test Set (Production)</w:t>
       </w:r>
-      <w:bookmarkEnd w:id="66"/>
+      <w:bookmarkEnd w:id="65"/>
     </w:p>
     <w:tbl>
       <w:tblPr>
@@ -13731,9 +13737,9 @@
           <w:color w:val="E97132" w:themeColor="accent2"/>
         </w:rPr>
       </w:pPr>
-      <w:bookmarkStart w:id="67" w:name="Xb3601224f87c86f2f27cc9d63d643f749f085e9"/>
-      <w:bookmarkStart w:id="68" w:name="_Toc237672689"/>
-      <w:bookmarkEnd w:id="65"/>
+      <w:bookmarkStart w:id="67" w:name="_Toc237672689"/>
+      <w:bookmarkStart w:id="68" w:name="Xb3601224f87c86f2f27cc9d63d643f749f085e9"/>
+      <w:bookmarkEnd w:id="66"/>
       <w:r>
         <w:rPr>
           <w:i/>
@@ -13742,7 +13748,7 @@
         </w:rPr>
         <w:t>4.4 Cross-Architecture Leaderboard (Frozen Test Set)</w:t>
       </w:r>
-      <w:bookmarkEnd w:id="68"/>
+      <w:bookmarkEnd w:id="67"/>
     </w:p>
     <w:tbl>
       <w:tblPr>
@@ -14302,9 +14308,9 @@
           <w:color w:val="E97132" w:themeColor="accent2"/>
         </w:rPr>
       </w:pPr>
-      <w:bookmarkStart w:id="69" w:name="X7d43072b51a3f395a947d29be6f632e669ccd00"/>
-      <w:bookmarkStart w:id="70" w:name="_Toc237672690"/>
-      <w:bookmarkEnd w:id="67"/>
+      <w:bookmarkStart w:id="69" w:name="_Toc237672690"/>
+      <w:bookmarkStart w:id="70" w:name="X7d43072b51a3f395a947d29be6f632e669ccd00"/>
+      <w:bookmarkEnd w:id="68"/>
       <w:r>
         <w:rPr>
           <w:i/>
@@ -14313,7 +14319,7 @@
         </w:rPr>
         <w:t>4.5 Hyperparameter Sweep Results (Milestone 5A)</w:t>
       </w:r>
-      <w:bookmarkEnd w:id="70"/>
+      <w:bookmarkEnd w:id="69"/>
     </w:p>
     <w:p>
       <w:pPr>
@@ -15358,9 +15364,9 @@
           <w:color w:val="E97132" w:themeColor="accent2"/>
         </w:rPr>
       </w:pPr>
-      <w:bookmarkStart w:id="71" w:name="bipia-ood-results-milestone-5b"/>
-      <w:bookmarkStart w:id="72" w:name="_Toc237672691"/>
-      <w:bookmarkEnd w:id="69"/>
+      <w:bookmarkStart w:id="71" w:name="_Toc237672691"/>
+      <w:bookmarkStart w:id="72" w:name="bipia-ood-results-milestone-5b"/>
+      <w:bookmarkEnd w:id="70"/>
       <w:r>
         <w:rPr>
           <w:i/>
@@ -15369,7 +15375,7 @@
         </w:rPr>
         <w:t>4.6 BIPIA OOD Results (Milestone 5B)</w:t>
       </w:r>
-      <w:bookmarkEnd w:id="72"/>
+      <w:bookmarkEnd w:id="71"/>
     </w:p>
     <w:tbl>
       <w:tblPr>
@@ -15723,10 +15729,10 @@
           <w:u w:val="single"/>
         </w:rPr>
       </w:pPr>
-      <w:bookmarkStart w:id="73" w:name="trade-off-analysis"/>
-      <w:bookmarkStart w:id="74" w:name="_Toc237672692"/>
-      <w:bookmarkEnd w:id="59"/>
-      <w:bookmarkEnd w:id="71"/>
+      <w:bookmarkStart w:id="73" w:name="_Toc237672692"/>
+      <w:bookmarkStart w:id="74" w:name="trade-off-analysis"/>
+      <w:bookmarkEnd w:id="60"/>
+      <w:bookmarkEnd w:id="72"/>
       <w:r>
         <w:rPr>
           <w:b/>
@@ -15736,7 +15742,7 @@
         </w:rPr>
         <w:t>5. Trade-off Analysis</w:t>
       </w:r>
-      <w:bookmarkEnd w:id="74"/>
+      <w:bookmarkEnd w:id="73"/>
     </w:p>
     <w:p>
       <w:pPr>
@@ -15747,8 +15753,8 @@
           <w:color w:val="E97132" w:themeColor="accent2"/>
         </w:rPr>
       </w:pPr>
-      <w:bookmarkStart w:id="75" w:name="baseline-vs.-custom-distilbert"/>
-      <w:bookmarkStart w:id="76" w:name="_Toc237672693"/>
+      <w:bookmarkStart w:id="75" w:name="_Toc237672693"/>
+      <w:bookmarkStart w:id="76" w:name="baseline-vs.-custom-distilbert"/>
       <w:r>
         <w:rPr>
           <w:i/>
@@ -15757,7 +15763,7 @@
         </w:rPr>
         <w:t>5.1 Baseline vs. Custom DistilBERT</w:t>
       </w:r>
-      <w:bookmarkEnd w:id="76"/>
+      <w:bookmarkEnd w:id="75"/>
     </w:p>
     <w:tbl>
       <w:tblPr>
@@ -16179,9 +16185,9 @@
           <w:color w:val="E97132" w:themeColor="accent2"/>
         </w:rPr>
       </w:pPr>
-      <w:bookmarkStart w:id="77" w:name="X880b2389f85e143ee547dd5b06f7b019e78d672"/>
-      <w:bookmarkStart w:id="78" w:name="_Toc237672694"/>
-      <w:bookmarkEnd w:id="75"/>
+      <w:bookmarkStart w:id="77" w:name="_Toc237672694"/>
+      <w:bookmarkStart w:id="78" w:name="X880b2389f85e143ee547dd5b06f7b019e78d672"/>
+      <w:bookmarkEnd w:id="76"/>
       <w:r>
         <w:rPr>
           <w:i/>
@@ -16190,7 +16196,7 @@
         </w:rPr>
         <w:t>5.2 Precision–Recall Wall (Hyperparameter Sweeps)</w:t>
       </w:r>
-      <w:bookmarkEnd w:id="78"/>
+      <w:bookmarkEnd w:id="77"/>
     </w:p>
     <w:p>
       <w:pPr>
@@ -16351,9 +16357,9 @@
           <w:color w:val="E97132" w:themeColor="accent2"/>
         </w:rPr>
       </w:pPr>
-      <w:bookmarkStart w:id="79" w:name="paradigm-trade-offs-milestone-4"/>
-      <w:bookmarkStart w:id="80" w:name="_Toc237672695"/>
-      <w:bookmarkEnd w:id="77"/>
+      <w:bookmarkStart w:id="79" w:name="_Toc237672695"/>
+      <w:bookmarkStart w:id="80" w:name="paradigm-trade-offs-milestone-4"/>
+      <w:bookmarkEnd w:id="78"/>
       <w:r>
         <w:rPr>
           <w:i/>
@@ -16362,7 +16368,7 @@
         </w:rPr>
         <w:t>5.3 Paradigm Trade-offs (Milestone 4)</w:t>
       </w:r>
-      <w:bookmarkEnd w:id="80"/>
+      <w:bookmarkEnd w:id="79"/>
     </w:p>
     <w:tbl>
       <w:tblPr>
@@ -16650,9 +16656,9 @@
           <w:color w:val="E97132" w:themeColor="accent2"/>
         </w:rPr>
       </w:pPr>
-      <w:bookmarkStart w:id="81" w:name="direct-vs.-indirect-ood-trade-off"/>
-      <w:bookmarkStart w:id="82" w:name="_Toc237672696"/>
-      <w:bookmarkEnd w:id="79"/>
+      <w:bookmarkStart w:id="81" w:name="_Toc237672696"/>
+      <w:bookmarkStart w:id="82" w:name="direct-vs.-indirect-ood-trade-off"/>
+      <w:bookmarkEnd w:id="80"/>
       <w:r>
         <w:rPr>
           <w:i/>
@@ -16662,7 +16668,7 @@
         <w:lastRenderedPageBreak/>
         <w:t>5.4 Direct vs. Indirect (OOD) Trade-off</w:t>
       </w:r>
-      <w:bookmarkEnd w:id="82"/>
+      <w:bookmarkEnd w:id="81"/>
     </w:p>
     <w:tbl>
       <w:tblPr>
@@ -16912,9 +16918,9 @@
           <w:color w:val="E97132" w:themeColor="accent2"/>
         </w:rPr>
       </w:pPr>
-      <w:bookmarkStart w:id="83" w:name="latency-vs.-security"/>
-      <w:bookmarkStart w:id="84" w:name="_Toc237672697"/>
-      <w:bookmarkEnd w:id="81"/>
+      <w:bookmarkStart w:id="83" w:name="_Toc237672697"/>
+      <w:bookmarkStart w:id="84" w:name="latency-vs.-security"/>
+      <w:bookmarkEnd w:id="82"/>
       <w:r>
         <w:rPr>
           <w:i/>
@@ -16923,7 +16929,7 @@
         </w:rPr>
         <w:t>5.5 Latency vs. Security</w:t>
       </w:r>
-      <w:bookmarkEnd w:id="84"/>
+      <w:bookmarkEnd w:id="83"/>
     </w:p>
     <w:p>
       <w:pPr>
@@ -16985,10 +16991,10 @@
           <w:u w:val="single"/>
         </w:rPr>
       </w:pPr>
-      <w:bookmarkStart w:id="85" w:name="conclusions"/>
-      <w:bookmarkStart w:id="86" w:name="_Toc237672698"/>
-      <w:bookmarkEnd w:id="73"/>
-      <w:bookmarkEnd w:id="83"/>
+      <w:bookmarkStart w:id="85" w:name="_Toc237672698"/>
+      <w:bookmarkStart w:id="86" w:name="conclusions"/>
+      <w:bookmarkEnd w:id="74"/>
+      <w:bookmarkEnd w:id="84"/>
       <w:r>
         <w:rPr>
           <w:b/>
@@ -16998,7 +17004,7 @@
         </w:rPr>
         <w:t>6. Conclusions</w:t>
       </w:r>
-      <w:bookmarkEnd w:id="86"/>
+      <w:bookmarkEnd w:id="85"/>
     </w:p>
     <w:p>
       <w:pPr>
@@ -17278,8 +17284,8 @@
           <w:color w:val="E97132" w:themeColor="accent2"/>
         </w:rPr>
       </w:pPr>
-      <w:bookmarkStart w:id="87" w:name="future-work"/>
-      <w:bookmarkStart w:id="88" w:name="_Toc237672699"/>
+      <w:bookmarkStart w:id="87" w:name="_Toc237672699"/>
+      <w:bookmarkStart w:id="88" w:name="future-work"/>
       <w:r>
         <w:rPr>
           <w:i/>
@@ -17288,7 +17294,7 @@
         </w:rPr>
         <w:t>6.1 Future Work</w:t>
       </w:r>
-      <w:bookmarkEnd w:id="88"/>
+      <w:bookmarkEnd w:id="87"/>
     </w:p>
     <w:p>
       <w:pPr>
@@ -17435,10 +17441,10 @@
           <w:u w:val="single"/>
         </w:rPr>
       </w:pPr>
-      <w:bookmarkStart w:id="89" w:name="references"/>
-      <w:bookmarkStart w:id="90" w:name="_Toc237672700"/>
-      <w:bookmarkEnd w:id="85"/>
-      <w:bookmarkEnd w:id="87"/>
+      <w:bookmarkStart w:id="89" w:name="_Toc237672700"/>
+      <w:bookmarkStart w:id="90" w:name="references"/>
+      <w:bookmarkEnd w:id="86"/>
+      <w:bookmarkEnd w:id="88"/>
       <w:r>
         <w:rPr>
           <w:b/>
@@ -17448,7 +17454,7 @@
         </w:rPr>
         <w:t>7. References</w:t>
       </w:r>
-      <w:bookmarkEnd w:id="90"/>
+      <w:bookmarkEnd w:id="89"/>
     </w:p>
     <w:p>
       <w:pPr>
@@ -18016,9 +18022,9 @@
           <w:u w:val="single"/>
         </w:rPr>
       </w:pPr>
-      <w:bookmarkStart w:id="91" w:name="appendix-a-key-scripts"/>
-      <w:bookmarkStart w:id="92" w:name="_Toc237672701"/>
-      <w:bookmarkEnd w:id="89"/>
+      <w:bookmarkStart w:id="91" w:name="_Toc237672701"/>
+      <w:bookmarkStart w:id="92" w:name="appendix-a-key-scripts"/>
+      <w:bookmarkEnd w:id="90"/>
       <w:r>
         <w:rPr>
           <w:b/>
@@ -18028,7 +18034,7 @@
         </w:rPr>
         <w:t>Appendix A — Key Scripts</w:t>
       </w:r>
-      <w:bookmarkEnd w:id="92"/>
+      <w:bookmarkEnd w:id="91"/>
     </w:p>
     <w:tbl>
       <w:tblPr>
@@ -18344,9 +18350,9 @@
           <w:u w:val="single"/>
         </w:rPr>
       </w:pPr>
-      <w:bookmarkStart w:id="93" w:name="appendix-b-contract-scorecard-final"/>
-      <w:bookmarkStart w:id="94" w:name="_Toc237672702"/>
-      <w:bookmarkEnd w:id="91"/>
+      <w:bookmarkStart w:id="93" w:name="_Toc237672702"/>
+      <w:bookmarkStart w:id="94" w:name="appendix-b-contract-scorecard-final"/>
+      <w:bookmarkEnd w:id="92"/>
       <w:r>
         <w:rPr>
           <w:b/>
@@ -18356,7 +18362,7 @@
         </w:rPr>
         <w:t>Appendix B — Contract Scorecard (Final)</w:t>
       </w:r>
-      <w:bookmarkEnd w:id="94"/>
+      <w:bookmarkEnd w:id="93"/>
     </w:p>
     <w:tbl>
       <w:tblPr>
@@ -18786,9 +18792,9 @@
           <w:u w:val="single"/>
         </w:rPr>
       </w:pPr>
-      <w:bookmarkStart w:id="95" w:name="Xcbbf1a03f130006c8600561b34388e94b1db04c"/>
-      <w:bookmarkStart w:id="96" w:name="_Toc237672703"/>
-      <w:bookmarkEnd w:id="93"/>
+      <w:bookmarkStart w:id="95" w:name="_Toc237672703"/>
+      <w:bookmarkStart w:id="96" w:name="Xcbbf1a03f130006c8600561b34388e94b1db04c"/>
+      <w:bookmarkEnd w:id="94"/>
       <w:r>
         <w:rPr>
           <w:b/>
@@ -18798,7 +18804,7 @@
         </w:rPr>
         <w:t>Appendix C — Transformer Embedding &amp; Self-Attention Details</w:t>
       </w:r>
-      <w:bookmarkEnd w:id="96"/>
+      <w:bookmarkEnd w:id="95"/>
     </w:p>
     <w:p>
       <w:pPr>
@@ -18817,8 +18823,8 @@
           <w:color w:val="E97132" w:themeColor="accent2"/>
         </w:rPr>
       </w:pPr>
-      <w:bookmarkStart w:id="97" w:name="c.1-embedding-layer-ids-dense-vectors"/>
-      <w:bookmarkStart w:id="98" w:name="_Toc237672704"/>
+      <w:bookmarkStart w:id="97" w:name="_Toc237672704"/>
+      <w:bookmarkStart w:id="98" w:name="c.1-embedding-layer-ids-dense-vectors"/>
       <w:r>
         <w:rPr>
           <w:i/>
@@ -18827,7 +18833,7 @@
         </w:rPr>
         <w:t>C.1 Embedding layer (IDs → dense vectors)</w:t>
       </w:r>
-      <w:bookmarkEnd w:id="98"/>
+      <w:bookmarkEnd w:id="97"/>
     </w:p>
     <w:p>
       <w:pPr>
@@ -19055,9 +19061,9 @@
           <w:color w:val="E97132" w:themeColor="accent2"/>
         </w:rPr>
       </w:pPr>
-      <w:bookmarkStart w:id="99" w:name="c.2-multi-head-self-attention"/>
-      <w:bookmarkStart w:id="100" w:name="_Toc237672705"/>
-      <w:bookmarkEnd w:id="97"/>
+      <w:bookmarkStart w:id="99" w:name="_Toc237672705"/>
+      <w:bookmarkStart w:id="100" w:name="c.2-multi-head-self-attention"/>
+      <w:bookmarkEnd w:id="98"/>
       <w:r>
         <w:rPr>
           <w:i/>
@@ -19066,7 +19072,7 @@
         </w:rPr>
         <w:t>C.2 Multi-Head Self-Attention</w:t>
       </w:r>
-      <w:bookmarkEnd w:id="100"/>
+      <w:bookmarkEnd w:id="99"/>
     </w:p>
     <w:p>
       <w:pPr>
@@ -19694,8 +19700,8 @@
       <w:r>
         <w:t>—is the prompt summary used by the classification head in Section 2.3.</w:t>
       </w:r>
-      <w:bookmarkEnd w:id="95"/>
-      <w:bookmarkEnd w:id="99"/>
+      <w:bookmarkEnd w:id="96"/>
+      <w:bookmarkEnd w:id="100"/>
     </w:p>
     <w:sectPr>
       <w:footerReference w:type="even" r:id="rId16"/>
@@ -20837,6 +20843,7 @@
   <w:style w:type="character" w:default="1" w:styleId="DefaultParagraphFont">
     <w:name w:val="Default Paragraph Font"/>
     <w:uiPriority w:val="1"/>
+    <w:semiHidden/>
     <w:unhideWhenUsed/>
   </w:style>
   <w:style w:type="table" w:default="1" w:styleId="TableNormal">

</xml_diff>